<commit_message>
Update resume download to 2026 version
Co-authored-by: Cursor <cursoragent@cursor.com>
</commit_message>
<xml_diff>
--- a/client/public/Lewis_Resume_2025_Full.docx
+++ b/client/public/Lewis_Resume_2025_Full.docx
@@ -253,15 +253,7 @@
                 <w:sz w:val="20"/>
                 <w:szCs w:val="20"/>
               </w:rPr>
-              <w:t>Partner with client</w:t>
-            </w:r>
-            <w:r>
-              <w:rPr>
-                <w:rFonts w:asciiTheme="minorHAnsi" w:eastAsiaTheme="minorEastAsia" w:hAnsiTheme="minorHAnsi" w:cstheme="minorBidi"/>
-                <w:sz w:val="20"/>
-                <w:szCs w:val="20"/>
-              </w:rPr>
-              <w:t>s on discovery through UI execution</w:t>
+              <w:t>Partner with clients on discovery through UI execution</w:t>
             </w:r>
             <w:r>
               <w:rPr>
@@ -352,17 +344,7 @@
                 <w:sz w:val="20"/>
                 <w:szCs w:val="20"/>
               </w:rPr>
-              <w:t>P</w:t>
-            </w:r>
-            <w:r>
-              <w:rPr>
-                <w:rFonts w:asciiTheme="minorHAnsi" w:eastAsiaTheme="minorEastAsia" w:hAnsiTheme="minorHAnsi" w:cstheme="minorBidi"/>
-                <w:b/>
-                <w:bCs/>
-                <w:sz w:val="20"/>
-                <w:szCs w:val="20"/>
-              </w:rPr>
-              <w:t xml:space="preserve">roject management </w:t>
+              <w:t xml:space="preserve">Project management </w:t>
             </w:r>
             <w:r>
               <w:rPr>
@@ -502,6 +484,319 @@
             </w:r>
           </w:p>
           <w:p>
+            <w:pPr>
+              <w:rPr>
+                <w:rFonts w:eastAsia="Times New Roman"/>
+                <w:sz w:val="16"/>
+                <w:szCs w:val="16"/>
+              </w:rPr>
+            </w:pPr>
+          </w:p>
+          <w:p>
+            <w:r>
+              <w:rPr>
+                <w:b/>
+                <w:bCs/>
+                <w:sz w:val="26"/>
+                <w:szCs w:val="26"/>
+              </w:rPr>
+              <w:t>UX Engineer</w:t>
+            </w:r>
+            <w:r>
+              <w:rPr>
+                <w:b/>
+                <w:bCs/>
+                <w:sz w:val="26"/>
+                <w:szCs w:val="26"/>
+              </w:rPr>
+              <w:t>, Design Systems</w:t>
+            </w:r>
+            <w:r>
+              <w:rPr>
+                <w:b/>
+                <w:bCs/>
+                <w:sz w:val="26"/>
+                <w:szCs w:val="26"/>
+              </w:rPr>
+              <w:t xml:space="preserve">   </w:t>
+            </w:r>
+            <w:r>
+              <w:rPr>
+                <w:b/>
+                <w:bCs/>
+                <w:sz w:val="26"/>
+                <w:szCs w:val="26"/>
+              </w:rPr>
+              <w:t xml:space="preserve">                                                           </w:t>
+            </w:r>
+            <w:r>
+              <w:t>May</w:t>
+            </w:r>
+            <w:r>
+              <w:t xml:space="preserve"> 20</w:t>
+            </w:r>
+            <w:r>
+              <w:t>26</w:t>
+            </w:r>
+            <w:r>
+              <w:t xml:space="preserve"> – Sep 20</w:t>
+            </w:r>
+            <w:r>
+              <w:t>26</w:t>
+            </w:r>
+          </w:p>
+          <w:p>
+            <w:r>
+              <w:rPr>
+                <w:b/>
+                <w:bCs/>
+              </w:rPr>
+              <w:t>Elevate Jet</w:t>
+            </w:r>
+            <w:r>
+              <w:rPr>
+                <w:b/>
+                <w:bCs/>
+              </w:rPr>
+              <w:t>,</w:t>
+            </w:r>
+            <w:r>
+              <w:t xml:space="preserve"> Dallas, Texas</w:t>
+            </w:r>
+          </w:p>
+          <w:p>
+            <w:pPr>
+              <w:numPr>
+                <w:ilvl w:val="0"/>
+                <w:numId w:val="30"/>
+              </w:numPr>
+              <w:tabs>
+                <w:tab w:val="clear" w:pos="720"/>
+                <w:tab w:val="num" w:pos="360"/>
+              </w:tabs>
+              <w:ind w:left="342"/>
+              <w:rPr>
+                <w:rFonts w:asciiTheme="minorHAnsi" w:eastAsiaTheme="minorEastAsia" w:hAnsiTheme="minorHAnsi" w:cstheme="minorBidi"/>
+                <w:color w:val="191919"/>
+                <w:sz w:val="20"/>
+                <w:szCs w:val="20"/>
+              </w:rPr>
+            </w:pPr>
+            <w:r>
+              <w:rPr>
+                <w:rFonts w:asciiTheme="minorHAnsi" w:eastAsiaTheme="minorEastAsia" w:hAnsiTheme="minorHAnsi" w:cstheme="minorBidi"/>
+                <w:color w:val="191919"/>
+                <w:sz w:val="20"/>
+                <w:szCs w:val="20"/>
+              </w:rPr>
+              <w:t xml:space="preserve">Built a </w:t>
+            </w:r>
+            <w:r>
+              <w:rPr>
+                <w:rFonts w:asciiTheme="minorHAnsi" w:eastAsiaTheme="minorEastAsia" w:hAnsiTheme="minorHAnsi" w:cstheme="minorBidi"/>
+                <w:b/>
+                <w:bCs/>
+                <w:color w:val="191919"/>
+                <w:sz w:val="20"/>
+                <w:szCs w:val="20"/>
+              </w:rPr>
+              <w:t>design system from scratch</w:t>
+            </w:r>
+            <w:r>
+              <w:rPr>
+                <w:rFonts w:asciiTheme="minorHAnsi" w:eastAsiaTheme="minorEastAsia" w:hAnsiTheme="minorHAnsi" w:cstheme="minorBidi"/>
+                <w:color w:val="191919"/>
+                <w:sz w:val="20"/>
+                <w:szCs w:val="20"/>
+              </w:rPr>
+              <w:t xml:space="preserve"> in Figma, turning inherited type, color, and icon assets into a full component library with a two-tier token structure and a hybrid spacing scale</w:t>
+            </w:r>
+          </w:p>
+          <w:p>
+            <w:pPr>
+              <w:numPr>
+                <w:ilvl w:val="0"/>
+                <w:numId w:val="30"/>
+              </w:numPr>
+              <w:tabs>
+                <w:tab w:val="clear" w:pos="720"/>
+                <w:tab w:val="num" w:pos="360"/>
+              </w:tabs>
+              <w:ind w:left="342"/>
+              <w:rPr>
+                <w:rFonts w:asciiTheme="minorHAnsi" w:eastAsiaTheme="minorEastAsia" w:hAnsiTheme="minorHAnsi" w:cstheme="minorBidi"/>
+                <w:color w:val="191919"/>
+                <w:sz w:val="20"/>
+                <w:szCs w:val="20"/>
+              </w:rPr>
+            </w:pPr>
+            <w:r>
+              <w:rPr>
+                <w:rFonts w:asciiTheme="minorHAnsi" w:eastAsiaTheme="minorEastAsia" w:hAnsiTheme="minorHAnsi" w:cstheme="minorBidi"/>
+                <w:color w:val="191919"/>
+                <w:sz w:val="20"/>
+                <w:szCs w:val="20"/>
+              </w:rPr>
+              <w:t xml:space="preserve">Led a full rebrand across </w:t>
+            </w:r>
+            <w:proofErr w:type="gramStart"/>
+            <w:r>
+              <w:rPr>
+                <w:rFonts w:asciiTheme="minorHAnsi" w:eastAsiaTheme="minorEastAsia" w:hAnsiTheme="minorHAnsi" w:cstheme="minorBidi"/>
+                <w:color w:val="191919"/>
+                <w:sz w:val="20"/>
+                <w:szCs w:val="20"/>
+              </w:rPr>
+              <w:t>website</w:t>
+            </w:r>
+            <w:proofErr w:type="gramEnd"/>
+            <w:r>
+              <w:rPr>
+                <w:rFonts w:asciiTheme="minorHAnsi" w:eastAsiaTheme="minorEastAsia" w:hAnsiTheme="minorHAnsi" w:cstheme="minorBidi"/>
+                <w:color w:val="191919"/>
+                <w:sz w:val="20"/>
+                <w:szCs w:val="20"/>
+              </w:rPr>
+              <w:t xml:space="preserve">, mobile web, and native </w:t>
+            </w:r>
+            <w:proofErr w:type="gramStart"/>
+            <w:r>
+              <w:rPr>
+                <w:rFonts w:asciiTheme="minorHAnsi" w:eastAsiaTheme="minorEastAsia" w:hAnsiTheme="minorHAnsi" w:cstheme="minorBidi"/>
+                <w:color w:val="191919"/>
+                <w:sz w:val="20"/>
+                <w:szCs w:val="20"/>
+              </w:rPr>
+              <w:t>app</w:t>
+            </w:r>
+            <w:proofErr w:type="gramEnd"/>
+            <w:r>
+              <w:rPr>
+                <w:rFonts w:asciiTheme="minorHAnsi" w:eastAsiaTheme="minorEastAsia" w:hAnsiTheme="minorHAnsi" w:cstheme="minorBidi"/>
+                <w:color w:val="191919"/>
+                <w:sz w:val="20"/>
+                <w:szCs w:val="20"/>
+              </w:rPr>
+              <w:t>, moving all three platforms onto the new system so they share one visual language</w:t>
+            </w:r>
+          </w:p>
+          <w:p>
+            <w:pPr>
+              <w:numPr>
+                <w:ilvl w:val="0"/>
+                <w:numId w:val="30"/>
+              </w:numPr>
+              <w:tabs>
+                <w:tab w:val="clear" w:pos="720"/>
+                <w:tab w:val="num" w:pos="360"/>
+              </w:tabs>
+              <w:ind w:left="342"/>
+              <w:rPr>
+                <w:rFonts w:asciiTheme="minorHAnsi" w:eastAsiaTheme="minorEastAsia" w:hAnsiTheme="minorHAnsi" w:cstheme="minorBidi"/>
+                <w:color w:val="191919"/>
+                <w:sz w:val="20"/>
+                <w:szCs w:val="20"/>
+              </w:rPr>
+            </w:pPr>
+            <w:r>
+              <w:rPr>
+                <w:rFonts w:asciiTheme="minorHAnsi" w:eastAsiaTheme="minorEastAsia" w:hAnsiTheme="minorHAnsi" w:cstheme="minorBidi"/>
+                <w:color w:val="191919"/>
+                <w:sz w:val="20"/>
+                <w:szCs w:val="20"/>
+              </w:rPr>
+              <w:t>Designed flexible, property-driven components (</w:t>
+            </w:r>
+            <w:proofErr w:type="gramStart"/>
+            <w:r>
+              <w:rPr>
+                <w:rFonts w:asciiTheme="minorHAnsi" w:eastAsiaTheme="minorEastAsia" w:hAnsiTheme="minorHAnsi" w:cstheme="minorBidi"/>
+                <w:color w:val="191919"/>
+                <w:sz w:val="20"/>
+                <w:szCs w:val="20"/>
+              </w:rPr>
+              <w:t>instance</w:t>
+            </w:r>
+            <w:proofErr w:type="gramEnd"/>
+            <w:r>
+              <w:rPr>
+                <w:rFonts w:asciiTheme="minorHAnsi" w:eastAsiaTheme="minorEastAsia" w:hAnsiTheme="minorHAnsi" w:cstheme="minorBidi"/>
+                <w:color w:val="191919"/>
+                <w:sz w:val="20"/>
+                <w:szCs w:val="20"/>
+              </w:rPr>
+              <w:t xml:space="preserve"> swaps, </w:t>
+            </w:r>
+            <w:proofErr w:type="spellStart"/>
+            <w:r>
+              <w:rPr>
+                <w:rFonts w:asciiTheme="minorHAnsi" w:eastAsiaTheme="minorEastAsia" w:hAnsiTheme="minorHAnsi" w:cstheme="minorBidi"/>
+                <w:color w:val="191919"/>
+                <w:sz w:val="20"/>
+                <w:szCs w:val="20"/>
+              </w:rPr>
+              <w:t>boolean</w:t>
+            </w:r>
+            <w:proofErr w:type="spellEnd"/>
+            <w:r>
+              <w:rPr>
+                <w:rFonts w:asciiTheme="minorHAnsi" w:eastAsiaTheme="minorEastAsia" w:hAnsiTheme="minorHAnsi" w:cstheme="minorBidi"/>
+                <w:color w:val="191919"/>
+                <w:sz w:val="20"/>
+                <w:szCs w:val="20"/>
+              </w:rPr>
+              <w:t xml:space="preserve"> variants) that cut design and handoff time and </w:t>
+            </w:r>
+            <w:proofErr w:type="gramStart"/>
+            <w:r>
+              <w:rPr>
+                <w:rFonts w:asciiTheme="minorHAnsi" w:eastAsiaTheme="minorEastAsia" w:hAnsiTheme="minorHAnsi" w:cstheme="minorBidi"/>
+                <w:color w:val="191919"/>
+                <w:sz w:val="20"/>
+                <w:szCs w:val="20"/>
+              </w:rPr>
+              <w:t>reduced</w:t>
+            </w:r>
+            <w:proofErr w:type="gramEnd"/>
+            <w:r>
+              <w:rPr>
+                <w:rFonts w:asciiTheme="minorHAnsi" w:eastAsiaTheme="minorEastAsia" w:hAnsiTheme="minorHAnsi" w:cstheme="minorBidi"/>
+                <w:color w:val="191919"/>
+                <w:sz w:val="20"/>
+                <w:szCs w:val="20"/>
+              </w:rPr>
+              <w:t xml:space="preserve"> one-off UI across platforms</w:t>
+            </w:r>
+          </w:p>
+          <w:p>
+            <w:pPr>
+              <w:numPr>
+                <w:ilvl w:val="0"/>
+                <w:numId w:val="30"/>
+              </w:numPr>
+              <w:tabs>
+                <w:tab w:val="clear" w:pos="720"/>
+                <w:tab w:val="num" w:pos="360"/>
+              </w:tabs>
+              <w:ind w:left="342"/>
+              <w:rPr>
+                <w:rFonts w:asciiTheme="minorHAnsi" w:eastAsiaTheme="minorEastAsia" w:hAnsiTheme="minorHAnsi" w:cstheme="minorBidi"/>
+                <w:color w:val="191919"/>
+                <w:sz w:val="20"/>
+                <w:szCs w:val="20"/>
+              </w:rPr>
+            </w:pPr>
+            <w:r>
+              <w:rPr>
+                <w:rFonts w:asciiTheme="minorHAnsi" w:eastAsiaTheme="minorEastAsia" w:hAnsiTheme="minorHAnsi" w:cstheme="minorBidi"/>
+                <w:color w:val="191919"/>
+                <w:sz w:val="20"/>
+                <w:szCs w:val="20"/>
+              </w:rPr>
+              <w:t>Redesigned the landing page across all platforms with new layouts and components aimed at driving account signups</w:t>
+            </w:r>
+          </w:p>
+          <w:p>
             <w:r>
               <w:rPr>
                 <w:b/>
@@ -844,7 +1139,16 @@
                 <w:sz w:val="20"/>
                 <w:szCs w:val="20"/>
               </w:rPr>
-              <w:t xml:space="preserve">Conducted in-depth research revealing customer confusion about recent AAdvantage program changes. Designed and launched an updated landing page featuring clear educational content, which </w:t>
+              <w:t xml:space="preserve">Conducted in-depth research revealing customer confusion about recent AAdvantage program </w:t>
+            </w:r>
+            <w:r>
+              <w:rPr>
+                <w:rFonts w:eastAsia="Times New Roman"/>
+                <w:sz w:val="20"/>
+                <w:szCs w:val="20"/>
+              </w:rPr>
+              <w:lastRenderedPageBreak/>
+              <w:t xml:space="preserve">changes. Designed and launched an updated landing page featuring clear educational content, which </w:t>
             </w:r>
             <w:r>
               <w:rPr>
@@ -876,89 +1180,13 @@
             </w:pPr>
           </w:p>
           <w:p>
-            <w:r>
-              <w:rPr>
-                <w:b/>
-                <w:bCs/>
-                <w:sz w:val="26"/>
-                <w:szCs w:val="26"/>
-              </w:rPr>
-              <w:t>Senior User Experience Architect (</w:t>
-            </w:r>
-            <w:proofErr w:type="gramStart"/>
-            <w:r>
-              <w:rPr>
-                <w:b/>
-                <w:bCs/>
-                <w:sz w:val="26"/>
-                <w:szCs w:val="26"/>
-              </w:rPr>
-              <w:t xml:space="preserve">Contract)  </w:t>
-            </w:r>
-            <w:r>
-              <w:rPr>
-                <w:b/>
-                <w:bCs/>
-                <w:sz w:val="26"/>
-                <w:szCs w:val="26"/>
-              </w:rPr>
-              <w:t xml:space="preserve"> </w:t>
-            </w:r>
-            <w:proofErr w:type="gramEnd"/>
-            <w:r>
-              <w:rPr>
-                <w:b/>
-                <w:bCs/>
-                <w:sz w:val="26"/>
-                <w:szCs w:val="26"/>
-              </w:rPr>
-              <w:t xml:space="preserve">                 </w:t>
-            </w:r>
-            <w:r>
-              <w:rPr>
-                <w:b/>
-                <w:bCs/>
-                <w:sz w:val="26"/>
-                <w:szCs w:val="26"/>
-              </w:rPr>
-              <w:t xml:space="preserve">                </w:t>
-            </w:r>
-            <w:r>
-              <w:t>Mar</w:t>
-            </w:r>
-            <w:r>
-              <w:t xml:space="preserve"> 2018 – Sep 2018</w:t>
-            </w:r>
-          </w:p>
-          <w:p>
-            <w:r>
-              <w:rPr>
-                <w:b/>
-                <w:bCs/>
-              </w:rPr>
-              <w:t>Publicis Hawkeye,</w:t>
-            </w:r>
-            <w:r>
-              <w:t xml:space="preserve"> Dallas, Texas</w:t>
-            </w:r>
-          </w:p>
-          <w:p>
-            <w:pPr>
-              <w:rPr>
-                <w:rFonts w:asciiTheme="minorHAnsi" w:eastAsiaTheme="minorEastAsia" w:hAnsiTheme="minorHAnsi" w:cstheme="minorBidi"/>
-                <w:sz w:val="20"/>
-                <w:szCs w:val="20"/>
-              </w:rPr>
-            </w:pPr>
-            <w:r>
-              <w:rPr>
-                <w:rFonts w:asciiTheme="minorHAnsi" w:eastAsiaTheme="minorEastAsia" w:hAnsiTheme="minorHAnsi" w:cstheme="minorBidi"/>
-                <w:color w:val="191919"/>
-                <w:sz w:val="20"/>
-                <w:szCs w:val="20"/>
-              </w:rPr>
-              <w:t>Senior architect lead for clients including American Airlines, BASF, Fannie Mae, United Healthcare, and University of Cincinnati Health. Guided the Interactive team through user-centered design, aligning business and user goals to create optimal online experiences. Oversaw information architecture, usability, and quality control from concept through execution, including requirements gathering, asset evaluation, site mapping, wireframing, and mentoring junior IAs.</w:t>
-            </w:r>
+            <w:pPr>
+              <w:rPr>
+                <w:rFonts w:asciiTheme="minorHAnsi" w:eastAsiaTheme="minorEastAsia" w:hAnsiTheme="minorHAnsi" w:cstheme="minorBidi"/>
+                <w:sz w:val="20"/>
+                <w:szCs w:val="20"/>
+              </w:rPr>
+            </w:pPr>
           </w:p>
         </w:tc>
         <w:tc>
@@ -1698,544 +1926,6 @@
         <w:pBdr>
           <w:bottom w:val="single" w:sz="4" w:space="1" w:color="808080"/>
         </w:pBdr>
-        <w:rPr>
-          <w:b/>
-          <w:bCs/>
-          <w:sz w:val="28"/>
-          <w:szCs w:val="28"/>
-        </w:rPr>
-      </w:pPr>
-      <w:r>
-        <w:rPr>
-          <w:b/>
-          <w:bCs/>
-          <w:sz w:val="16"/>
-          <w:szCs w:val="16"/>
-        </w:rPr>
-        <w:lastRenderedPageBreak/>
-        <w:br/>
-      </w:r>
-      <w:r>
-        <w:rPr>
-          <w:b/>
-          <w:bCs/>
-          <w:sz w:val="28"/>
-          <w:szCs w:val="28"/>
-        </w:rPr>
-        <w:t xml:space="preserve">PREVIOUS </w:t>
-      </w:r>
-      <w:r>
-        <w:rPr>
-          <w:b/>
-          <w:bCs/>
-          <w:sz w:val="28"/>
-          <w:szCs w:val="28"/>
-        </w:rPr>
-        <w:t>EXPERIENCE</w:t>
-      </w:r>
-    </w:p>
-    <w:p>
-      <w:pPr>
-        <w:rPr>
-          <w:b/>
-          <w:sz w:val="16"/>
-          <w:szCs w:val="16"/>
-        </w:rPr>
-      </w:pPr>
-    </w:p>
-    <w:p>
-      <w:pPr>
-        <w:rPr>
-          <w:b/>
-          <w:bCs/>
-          <w:sz w:val="20"/>
-          <w:szCs w:val="20"/>
-        </w:rPr>
-      </w:pPr>
-      <w:r>
-        <w:rPr>
-          <w:b/>
-          <w:bCs/>
-          <w:sz w:val="20"/>
-          <w:szCs w:val="20"/>
-        </w:rPr>
-        <w:t xml:space="preserve">Senior UX Architect, </w:t>
-      </w:r>
-      <w:proofErr w:type="spellStart"/>
-      <w:proofErr w:type="gramStart"/>
-      <w:r>
-        <w:rPr>
-          <w:b/>
-          <w:bCs/>
-          <w:sz w:val="20"/>
-          <w:szCs w:val="20"/>
-        </w:rPr>
-        <w:t>J.Hilburn</w:t>
-      </w:r>
-      <w:proofErr w:type="spellEnd"/>
-      <w:proofErr w:type="gramEnd"/>
-      <w:r>
-        <w:rPr>
-          <w:b/>
-          <w:bCs/>
-          <w:sz w:val="20"/>
-          <w:szCs w:val="20"/>
-        </w:rPr>
-        <w:t xml:space="preserve">, </w:t>
-      </w:r>
-      <w:r>
-        <w:rPr>
-          <w:sz w:val="20"/>
-          <w:szCs w:val="20"/>
-        </w:rPr>
-        <w:t>Dallas, Texas</w:t>
-      </w:r>
-    </w:p>
-    <w:p>
-      <w:pPr>
-        <w:rPr>
-          <w:b/>
-          <w:bCs/>
-          <w:sz w:val="20"/>
-          <w:szCs w:val="20"/>
-        </w:rPr>
-      </w:pPr>
-      <w:r>
-        <w:rPr>
-          <w:b/>
-          <w:bCs/>
-          <w:sz w:val="20"/>
-          <w:szCs w:val="20"/>
-        </w:rPr>
-        <w:t xml:space="preserve">UX Designer/Usability Advisor, </w:t>
-      </w:r>
-      <w:proofErr w:type="spellStart"/>
-      <w:r>
-        <w:rPr>
-          <w:b/>
-          <w:bCs/>
-          <w:sz w:val="20"/>
-          <w:szCs w:val="20"/>
-        </w:rPr>
-        <w:t>AustinCSI</w:t>
-      </w:r>
-      <w:proofErr w:type="spellEnd"/>
-      <w:r>
-        <w:rPr>
-          <w:b/>
-          <w:bCs/>
-          <w:sz w:val="20"/>
-          <w:szCs w:val="20"/>
-        </w:rPr>
-        <w:t xml:space="preserve"> Consulting (AT&amp;T),</w:t>
-      </w:r>
-      <w:r>
-        <w:rPr>
-          <w:sz w:val="20"/>
-          <w:szCs w:val="20"/>
-        </w:rPr>
-        <w:t xml:space="preserve"> Dallas, Texas</w:t>
-      </w:r>
-    </w:p>
-    <w:p>
-      <w:pPr>
-        <w:rPr>
-          <w:b/>
-          <w:bCs/>
-          <w:sz w:val="20"/>
-          <w:szCs w:val="20"/>
-        </w:rPr>
-      </w:pPr>
-      <w:r>
-        <w:rPr>
-          <w:b/>
-          <w:bCs/>
-          <w:sz w:val="20"/>
-          <w:szCs w:val="20"/>
-        </w:rPr>
-        <w:t xml:space="preserve">UX </w:t>
-      </w:r>
-      <w:r>
-        <w:rPr>
-          <w:b/>
-          <w:bCs/>
-          <w:sz w:val="20"/>
-          <w:szCs w:val="20"/>
-        </w:rPr>
-        <w:t>Research Analyst</w:t>
-      </w:r>
-      <w:r>
-        <w:rPr>
-          <w:b/>
-          <w:bCs/>
-          <w:sz w:val="20"/>
-          <w:szCs w:val="20"/>
-        </w:rPr>
-        <w:t xml:space="preserve">, </w:t>
-      </w:r>
-      <w:r>
-        <w:rPr>
-          <w:b/>
-          <w:bCs/>
-          <w:sz w:val="20"/>
-          <w:szCs w:val="20"/>
-        </w:rPr>
-        <w:t>AT&amp;T</w:t>
-      </w:r>
-      <w:r>
-        <w:rPr>
-          <w:b/>
-          <w:bCs/>
-          <w:sz w:val="20"/>
-          <w:szCs w:val="20"/>
-        </w:rPr>
-        <w:t>,</w:t>
-      </w:r>
-      <w:r>
-        <w:rPr>
-          <w:sz w:val="20"/>
-          <w:szCs w:val="20"/>
-        </w:rPr>
-        <w:t xml:space="preserve"> Dallas, Texas</w:t>
-      </w:r>
-    </w:p>
-    <w:p>
-      <w:pPr>
-        <w:rPr>
-          <w:sz w:val="20"/>
-          <w:szCs w:val="20"/>
-        </w:rPr>
-      </w:pPr>
-      <w:r>
-        <w:rPr>
-          <w:b/>
-          <w:bCs/>
-          <w:sz w:val="20"/>
-          <w:szCs w:val="20"/>
-        </w:rPr>
-        <w:t>UX Consultant, Slalom Consulting,</w:t>
-      </w:r>
-      <w:r>
-        <w:rPr>
-          <w:sz w:val="20"/>
-          <w:szCs w:val="20"/>
-        </w:rPr>
-        <w:t xml:space="preserve"> Dallas, Texas</w:t>
-      </w:r>
-    </w:p>
-    <w:p>
-      <w:pPr>
-        <w:rPr>
-          <w:b/>
-          <w:bCs/>
-          <w:sz w:val="20"/>
-          <w:szCs w:val="20"/>
-        </w:rPr>
-      </w:pPr>
-      <w:r>
-        <w:rPr>
-          <w:b/>
-          <w:bCs/>
-          <w:sz w:val="20"/>
-          <w:szCs w:val="20"/>
-        </w:rPr>
-        <w:t>UX Lead Designer</w:t>
-      </w:r>
-      <w:r>
-        <w:rPr>
-          <w:sz w:val="20"/>
-          <w:szCs w:val="20"/>
-        </w:rPr>
-        <w:t xml:space="preserve">, </w:t>
-      </w:r>
-      <w:proofErr w:type="spellStart"/>
-      <w:r>
-        <w:rPr>
-          <w:b/>
-          <w:bCs/>
-          <w:sz w:val="20"/>
-          <w:szCs w:val="20"/>
-        </w:rPr>
-        <w:t>ThinkFinance</w:t>
-      </w:r>
-      <w:proofErr w:type="spellEnd"/>
-      <w:r>
-        <w:rPr>
-          <w:b/>
-          <w:bCs/>
-          <w:sz w:val="20"/>
-          <w:szCs w:val="20"/>
-        </w:rPr>
-        <w:t xml:space="preserve"> (Presta.com)</w:t>
-      </w:r>
-      <w:r>
-        <w:rPr>
-          <w:sz w:val="20"/>
-          <w:szCs w:val="20"/>
-        </w:rPr>
-        <w:t>, Fort Worth, Texas</w:t>
-      </w:r>
-    </w:p>
-    <w:p>
-      <w:pPr>
-        <w:rPr>
-          <w:b/>
-          <w:bCs/>
-          <w:sz w:val="20"/>
-          <w:szCs w:val="20"/>
-        </w:rPr>
-      </w:pPr>
-      <w:r>
-        <w:rPr>
-          <w:b/>
-          <w:bCs/>
-          <w:sz w:val="20"/>
-          <w:szCs w:val="20"/>
-        </w:rPr>
-        <w:t>Senior User Experience Designer</w:t>
-      </w:r>
-      <w:r>
-        <w:rPr>
-          <w:sz w:val="20"/>
-          <w:szCs w:val="20"/>
-        </w:rPr>
-        <w:t>,</w:t>
-      </w:r>
-      <w:r>
-        <w:rPr>
-          <w:b/>
-          <w:bCs/>
-          <w:sz w:val="20"/>
-          <w:szCs w:val="20"/>
-        </w:rPr>
-        <w:t xml:space="preserve"> Sabre Travel Network</w:t>
-      </w:r>
-      <w:r>
-        <w:rPr>
-          <w:sz w:val="20"/>
-          <w:szCs w:val="20"/>
-        </w:rPr>
-        <w:t>, Southlake, Texas</w:t>
-      </w:r>
-    </w:p>
-    <w:p>
-      <w:pPr>
-        <w:rPr>
-          <w:b/>
-          <w:bCs/>
-          <w:sz w:val="20"/>
-          <w:szCs w:val="20"/>
-        </w:rPr>
-      </w:pPr>
-      <w:r>
-        <w:rPr>
-          <w:b/>
-          <w:bCs/>
-          <w:sz w:val="20"/>
-          <w:szCs w:val="20"/>
-        </w:rPr>
-        <w:t>User Experience Consultant, Wipro Consulting</w:t>
-      </w:r>
-      <w:r>
-        <w:rPr>
-          <w:sz w:val="20"/>
-          <w:szCs w:val="20"/>
-        </w:rPr>
-        <w:t>, Bedford, Texas</w:t>
-      </w:r>
-    </w:p>
-    <w:p>
-      <w:pPr>
-        <w:rPr>
-          <w:sz w:val="20"/>
-          <w:szCs w:val="20"/>
-        </w:rPr>
-      </w:pPr>
-      <w:r>
-        <w:rPr>
-          <w:b/>
-          <w:bCs/>
-          <w:sz w:val="20"/>
-          <w:szCs w:val="20"/>
-        </w:rPr>
-        <w:t>Information Architect (Contract), Verizon</w:t>
-      </w:r>
-      <w:r>
-        <w:rPr>
-          <w:sz w:val="20"/>
-          <w:szCs w:val="20"/>
-        </w:rPr>
-        <w:t>, Irving, Texas</w:t>
-      </w:r>
-    </w:p>
-    <w:p>
-      <w:pPr>
-        <w:rPr>
-          <w:sz w:val="20"/>
-          <w:szCs w:val="20"/>
-        </w:rPr>
-      </w:pPr>
-      <w:r>
-        <w:rPr>
-          <w:b/>
-          <w:bCs/>
-          <w:sz w:val="20"/>
-          <w:szCs w:val="20"/>
-        </w:rPr>
-        <w:t>Information Architect (Consultant), Web Core Technologies</w:t>
-      </w:r>
-      <w:r>
-        <w:rPr>
-          <w:sz w:val="20"/>
-          <w:szCs w:val="20"/>
-        </w:rPr>
-        <w:t>, Austin, Texas</w:t>
-      </w:r>
-    </w:p>
-    <w:p>
-      <w:pPr>
-        <w:rPr>
-          <w:sz w:val="20"/>
-          <w:szCs w:val="20"/>
-        </w:rPr>
-      </w:pPr>
-      <w:r>
-        <w:rPr>
-          <w:b/>
-          <w:bCs/>
-          <w:sz w:val="20"/>
-          <w:szCs w:val="20"/>
-        </w:rPr>
-        <w:t>Interactive Web Developer, RMG Connect</w:t>
-      </w:r>
-      <w:r>
-        <w:rPr>
-          <w:sz w:val="20"/>
-          <w:szCs w:val="20"/>
-        </w:rPr>
-        <w:t>, Irving, Texas</w:t>
-      </w:r>
-    </w:p>
-    <w:p>
-      <w:pPr>
-        <w:rPr>
-          <w:sz w:val="20"/>
-          <w:szCs w:val="20"/>
-        </w:rPr>
-      </w:pPr>
-      <w:r>
-        <w:rPr>
-          <w:b/>
-          <w:bCs/>
-          <w:sz w:val="20"/>
-          <w:szCs w:val="20"/>
-        </w:rPr>
-        <w:t>Web Production Specialist (Contract), Susan G. Komen for the Cure</w:t>
-      </w:r>
-      <w:r>
-        <w:rPr>
-          <w:sz w:val="20"/>
-          <w:szCs w:val="20"/>
-        </w:rPr>
-        <w:t>, Dallas, Texas</w:t>
-      </w:r>
-    </w:p>
-    <w:p>
-      <w:pPr>
-        <w:rPr>
-          <w:sz w:val="20"/>
-          <w:szCs w:val="20"/>
-        </w:rPr>
-      </w:pPr>
-      <w:r>
-        <w:rPr>
-          <w:b/>
-          <w:bCs/>
-          <w:sz w:val="20"/>
-          <w:szCs w:val="20"/>
-        </w:rPr>
-        <w:t>Web Graphic Designer, The First American Corporation</w:t>
-      </w:r>
-      <w:r>
-        <w:rPr>
-          <w:sz w:val="20"/>
-          <w:szCs w:val="20"/>
-        </w:rPr>
-        <w:t>, Westlake, Texas</w:t>
-      </w:r>
-    </w:p>
-    <w:p>
-      <w:pPr>
-        <w:rPr>
-          <w:sz w:val="20"/>
-          <w:szCs w:val="20"/>
-        </w:rPr>
-      </w:pPr>
-      <w:r>
-        <w:rPr>
-          <w:b/>
-          <w:bCs/>
-          <w:sz w:val="20"/>
-          <w:szCs w:val="20"/>
-        </w:rPr>
-        <w:t xml:space="preserve">Webmaster, </w:t>
-      </w:r>
-      <w:proofErr w:type="spellStart"/>
-      <w:r>
-        <w:rPr>
-          <w:b/>
-          <w:bCs/>
-          <w:sz w:val="20"/>
-          <w:szCs w:val="20"/>
-        </w:rPr>
-        <w:t>TECSys</w:t>
-      </w:r>
-      <w:proofErr w:type="spellEnd"/>
-      <w:r>
-        <w:rPr>
-          <w:b/>
-          <w:bCs/>
-          <w:sz w:val="20"/>
-          <w:szCs w:val="20"/>
-        </w:rPr>
-        <w:t xml:space="preserve"> Development, Inc.</w:t>
-      </w:r>
-      <w:r>
-        <w:rPr>
-          <w:sz w:val="20"/>
-          <w:szCs w:val="20"/>
-        </w:rPr>
-        <w:t>, Plano, Texas</w:t>
-      </w:r>
-    </w:p>
-    <w:p>
-      <w:pPr>
-        <w:rPr>
-          <w:b/>
-          <w:bCs/>
-          <w:sz w:val="20"/>
-          <w:szCs w:val="20"/>
-        </w:rPr>
-      </w:pPr>
-      <w:r>
-        <w:rPr>
-          <w:b/>
-          <w:bCs/>
-          <w:sz w:val="20"/>
-          <w:szCs w:val="20"/>
-        </w:rPr>
-        <w:t>Web Developer 2, University of Houston</w:t>
-      </w:r>
-      <w:r>
-        <w:rPr>
-          <w:sz w:val="20"/>
-          <w:szCs w:val="20"/>
-        </w:rPr>
-        <w:t>, Houston, Texas</w:t>
-      </w:r>
-    </w:p>
-    <w:p>
-      <w:pPr>
         <w:rPr>
           <w:sz w:val="16"/>
           <w:szCs w:val="16"/>
@@ -2657,21 +2347,7 @@
             <w:rStyle w:val="Hyperlink"/>
             <w:rFonts w:asciiTheme="minorHAnsi" w:eastAsiaTheme="minorEastAsia" w:hAnsiTheme="minorHAnsi" w:cstheme="minorBidi"/>
           </w:rPr>
-          <w:t>http://www.cr</w:t>
-        </w:r>
-        <w:r>
-          <w:rPr>
-            <w:rStyle w:val="Hyperlink"/>
-            <w:rFonts w:asciiTheme="minorHAnsi" w:eastAsiaTheme="minorEastAsia" w:hAnsiTheme="minorHAnsi" w:cstheme="minorBidi"/>
-          </w:rPr>
-          <w:t>y</w:t>
-        </w:r>
-        <w:r>
-          <w:rPr>
-            <w:rStyle w:val="Hyperlink"/>
-            <w:rFonts w:asciiTheme="minorHAnsi" w:eastAsiaTheme="minorEastAsia" w:hAnsiTheme="minorHAnsi" w:cstheme="minorBidi"/>
-          </w:rPr>
-          <w:t>stalmcdermott.com</w:t>
+          <w:t>http://www.crystalmcdermott.com</w:t>
         </w:r>
       </w:hyperlink>
     </w:p>
@@ -3811,6 +3487,155 @@
     </w:lvl>
   </w:abstractNum>
   <w:abstractNum w:abstractNumId="12" w15:restartNumberingAfterBreak="0">
+    <w:nsid w:val="47460C50"/>
+    <w:multiLevelType w:val="multilevel"/>
+    <w:tmpl w:val="2E2C9906"/>
+    <w:lvl w:ilvl="0">
+      <w:start w:val="1"/>
+      <w:numFmt w:val="bullet"/>
+      <w:lvlText w:val=""/>
+      <w:lvlJc w:val="left"/>
+      <w:pPr>
+        <w:tabs>
+          <w:tab w:val="num" w:pos="720"/>
+        </w:tabs>
+        <w:ind w:left="720" w:hanging="360"/>
+      </w:pPr>
+      <w:rPr>
+        <w:rFonts w:ascii="Symbol" w:hAnsi="Symbol" w:hint="default"/>
+        <w:sz w:val="20"/>
+      </w:rPr>
+    </w:lvl>
+    <w:lvl w:ilvl="1" w:tentative="1">
+      <w:start w:val="1"/>
+      <w:numFmt w:val="bullet"/>
+      <w:lvlText w:val="o"/>
+      <w:lvlJc w:val="left"/>
+      <w:pPr>
+        <w:tabs>
+          <w:tab w:val="num" w:pos="1440"/>
+        </w:tabs>
+        <w:ind w:left="1440" w:hanging="360"/>
+      </w:pPr>
+      <w:rPr>
+        <w:rFonts w:ascii="Courier New" w:hAnsi="Courier New" w:hint="default"/>
+        <w:sz w:val="20"/>
+      </w:rPr>
+    </w:lvl>
+    <w:lvl w:ilvl="2" w:tentative="1">
+      <w:start w:val="1"/>
+      <w:numFmt w:val="bullet"/>
+      <w:lvlText w:val=""/>
+      <w:lvlJc w:val="left"/>
+      <w:pPr>
+        <w:tabs>
+          <w:tab w:val="num" w:pos="2160"/>
+        </w:tabs>
+        <w:ind w:left="2160" w:hanging="360"/>
+      </w:pPr>
+      <w:rPr>
+        <w:rFonts w:ascii="Wingdings" w:hAnsi="Wingdings" w:hint="default"/>
+        <w:sz w:val="20"/>
+      </w:rPr>
+    </w:lvl>
+    <w:lvl w:ilvl="3" w:tentative="1">
+      <w:start w:val="1"/>
+      <w:numFmt w:val="bullet"/>
+      <w:lvlText w:val=""/>
+      <w:lvlJc w:val="left"/>
+      <w:pPr>
+        <w:tabs>
+          <w:tab w:val="num" w:pos="2880"/>
+        </w:tabs>
+        <w:ind w:left="2880" w:hanging="360"/>
+      </w:pPr>
+      <w:rPr>
+        <w:rFonts w:ascii="Wingdings" w:hAnsi="Wingdings" w:hint="default"/>
+        <w:sz w:val="20"/>
+      </w:rPr>
+    </w:lvl>
+    <w:lvl w:ilvl="4" w:tentative="1">
+      <w:start w:val="1"/>
+      <w:numFmt w:val="bullet"/>
+      <w:lvlText w:val=""/>
+      <w:lvlJc w:val="left"/>
+      <w:pPr>
+        <w:tabs>
+          <w:tab w:val="num" w:pos="3600"/>
+        </w:tabs>
+        <w:ind w:left="3600" w:hanging="360"/>
+      </w:pPr>
+      <w:rPr>
+        <w:rFonts w:ascii="Wingdings" w:hAnsi="Wingdings" w:hint="default"/>
+        <w:sz w:val="20"/>
+      </w:rPr>
+    </w:lvl>
+    <w:lvl w:ilvl="5" w:tentative="1">
+      <w:start w:val="1"/>
+      <w:numFmt w:val="bullet"/>
+      <w:lvlText w:val=""/>
+      <w:lvlJc w:val="left"/>
+      <w:pPr>
+        <w:tabs>
+          <w:tab w:val="num" w:pos="4320"/>
+        </w:tabs>
+        <w:ind w:left="4320" w:hanging="360"/>
+      </w:pPr>
+      <w:rPr>
+        <w:rFonts w:ascii="Wingdings" w:hAnsi="Wingdings" w:hint="default"/>
+        <w:sz w:val="20"/>
+      </w:rPr>
+    </w:lvl>
+    <w:lvl w:ilvl="6" w:tentative="1">
+      <w:start w:val="1"/>
+      <w:numFmt w:val="bullet"/>
+      <w:lvlText w:val=""/>
+      <w:lvlJc w:val="left"/>
+      <w:pPr>
+        <w:tabs>
+          <w:tab w:val="num" w:pos="5040"/>
+        </w:tabs>
+        <w:ind w:left="5040" w:hanging="360"/>
+      </w:pPr>
+      <w:rPr>
+        <w:rFonts w:ascii="Wingdings" w:hAnsi="Wingdings" w:hint="default"/>
+        <w:sz w:val="20"/>
+      </w:rPr>
+    </w:lvl>
+    <w:lvl w:ilvl="7" w:tentative="1">
+      <w:start w:val="1"/>
+      <w:numFmt w:val="bullet"/>
+      <w:lvlText w:val=""/>
+      <w:lvlJc w:val="left"/>
+      <w:pPr>
+        <w:tabs>
+          <w:tab w:val="num" w:pos="5760"/>
+        </w:tabs>
+        <w:ind w:left="5760" w:hanging="360"/>
+      </w:pPr>
+      <w:rPr>
+        <w:rFonts w:ascii="Wingdings" w:hAnsi="Wingdings" w:hint="default"/>
+        <w:sz w:val="20"/>
+      </w:rPr>
+    </w:lvl>
+    <w:lvl w:ilvl="8" w:tentative="1">
+      <w:start w:val="1"/>
+      <w:numFmt w:val="bullet"/>
+      <w:lvlText w:val=""/>
+      <w:lvlJc w:val="left"/>
+      <w:pPr>
+        <w:tabs>
+          <w:tab w:val="num" w:pos="6480"/>
+        </w:tabs>
+        <w:ind w:left="6480" w:hanging="360"/>
+      </w:pPr>
+      <w:rPr>
+        <w:rFonts w:ascii="Wingdings" w:hAnsi="Wingdings" w:hint="default"/>
+        <w:sz w:val="20"/>
+      </w:rPr>
+    </w:lvl>
+  </w:abstractNum>
+  <w:abstractNum w:abstractNumId="13" w15:restartNumberingAfterBreak="0">
     <w:nsid w:val="488E2E13"/>
     <w:multiLevelType w:val="hybridMultilevel"/>
     <w:tmpl w:val="B4665CF4"/>
@@ -3923,7 +3748,7 @@
       </w:rPr>
     </w:lvl>
   </w:abstractNum>
-  <w:abstractNum w:abstractNumId="13" w15:restartNumberingAfterBreak="0">
+  <w:abstractNum w:abstractNumId="14" w15:restartNumberingAfterBreak="0">
     <w:nsid w:val="4A804937"/>
     <w:multiLevelType w:val="hybridMultilevel"/>
     <w:tmpl w:val="07824C3A"/>
@@ -4036,7 +3861,7 @@
       </w:rPr>
     </w:lvl>
   </w:abstractNum>
-  <w:abstractNum w:abstractNumId="14" w15:restartNumberingAfterBreak="0">
+  <w:abstractNum w:abstractNumId="15" w15:restartNumberingAfterBreak="0">
     <w:nsid w:val="5E0103DF"/>
     <w:multiLevelType w:val="hybridMultilevel"/>
     <w:tmpl w:val="865C0F1A"/>
@@ -4147,7 +3972,7 @@
       </w:pPr>
     </w:lvl>
   </w:abstractNum>
-  <w:abstractNum w:abstractNumId="15" w15:restartNumberingAfterBreak="0">
+  <w:abstractNum w:abstractNumId="16" w15:restartNumberingAfterBreak="0">
     <w:nsid w:val="65204D0F"/>
     <w:multiLevelType w:val="hybridMultilevel"/>
     <w:tmpl w:val="148CAA64"/>
@@ -4258,7 +4083,7 @@
       </w:pPr>
     </w:lvl>
   </w:abstractNum>
-  <w:abstractNum w:abstractNumId="16" w15:restartNumberingAfterBreak="0">
+  <w:abstractNum w:abstractNumId="17" w15:restartNumberingAfterBreak="0">
     <w:nsid w:val="66760509"/>
     <w:multiLevelType w:val="hybridMultilevel"/>
     <w:tmpl w:val="74E63454"/>
@@ -4370,7 +4195,7 @@
       </w:rPr>
     </w:lvl>
   </w:abstractNum>
-  <w:abstractNum w:abstractNumId="17" w15:restartNumberingAfterBreak="0">
+  <w:abstractNum w:abstractNumId="18" w15:restartNumberingAfterBreak="0">
     <w:nsid w:val="68A719F9"/>
     <w:multiLevelType w:val="hybridMultilevel"/>
     <w:tmpl w:val="1B40ED16"/>
@@ -4456,7 +4281,7 @@
       </w:pPr>
     </w:lvl>
   </w:abstractNum>
-  <w:abstractNum w:abstractNumId="18" w15:restartNumberingAfterBreak="0">
+  <w:abstractNum w:abstractNumId="19" w15:restartNumberingAfterBreak="0">
     <w:nsid w:val="74C57EDE"/>
     <w:multiLevelType w:val="hybridMultilevel"/>
     <w:tmpl w:val="A134DF1C"/>
@@ -4569,7 +4394,7 @@
       </w:rPr>
     </w:lvl>
   </w:abstractNum>
-  <w:abstractNum w:abstractNumId="19" w15:restartNumberingAfterBreak="0">
+  <w:abstractNum w:abstractNumId="20" w15:restartNumberingAfterBreak="0">
     <w:nsid w:val="74D67808"/>
     <w:multiLevelType w:val="hybridMultilevel"/>
     <w:tmpl w:val="292837C0"/>
@@ -4680,7 +4505,7 @@
       </w:pPr>
     </w:lvl>
   </w:abstractNum>
-  <w:abstractNum w:abstractNumId="20" w15:restartNumberingAfterBreak="0">
+  <w:abstractNum w:abstractNumId="21" w15:restartNumberingAfterBreak="0">
     <w:nsid w:val="79E17A52"/>
     <w:multiLevelType w:val="multilevel"/>
     <w:tmpl w:val="C658ABC4"/>
@@ -4829,7 +4654,7 @@
       </w:rPr>
     </w:lvl>
   </w:abstractNum>
-  <w:abstractNum w:abstractNumId="21" w15:restartNumberingAfterBreak="0">
+  <w:abstractNum w:abstractNumId="22" w15:restartNumberingAfterBreak="0">
     <w:nsid w:val="7BFF356A"/>
     <w:multiLevelType w:val="hybridMultilevel"/>
     <w:tmpl w:val="D62C125C"/>
@@ -4942,7 +4767,7 @@
       </w:rPr>
     </w:lvl>
   </w:abstractNum>
-  <w:abstractNum w:abstractNumId="22" w15:restartNumberingAfterBreak="0">
+  <w:abstractNum w:abstractNumId="23" w15:restartNumberingAfterBreak="0">
     <w:nsid w:val="7D8F2157"/>
     <w:multiLevelType w:val="hybridMultilevel"/>
     <w:tmpl w:val="63D41246"/>
@@ -5029,7 +4854,7 @@
       </w:pPr>
     </w:lvl>
   </w:abstractNum>
-  <w:abstractNum w:abstractNumId="23" w15:restartNumberingAfterBreak="0">
+  <w:abstractNum w:abstractNumId="24" w15:restartNumberingAfterBreak="0">
     <w:nsid w:val="7FD97763"/>
     <w:multiLevelType w:val="singleLevel"/>
     <w:tmpl w:val="D18C6CB6"/>
@@ -5045,10 +4870,10 @@
     </w:lvl>
   </w:abstractNum>
   <w:num w:numId="1" w16cid:durableId="1480458386">
-    <w:abstractNumId w:val="23"/>
+    <w:abstractNumId w:val="24"/>
   </w:num>
   <w:num w:numId="2" w16cid:durableId="1947810089">
-    <w:abstractNumId w:val="23"/>
+    <w:abstractNumId w:val="24"/>
     <w:lvlOverride w:ilvl="0">
       <w:lvl w:ilvl="0">
         <w:start w:val="2"/>
@@ -5063,7 +4888,7 @@
     </w:lvlOverride>
   </w:num>
   <w:num w:numId="3" w16cid:durableId="1661543286">
-    <w:abstractNumId w:val="23"/>
+    <w:abstractNumId w:val="24"/>
     <w:lvlOverride w:ilvl="0">
       <w:lvl w:ilvl="0">
         <w:start w:val="3"/>
@@ -5078,7 +4903,7 @@
     </w:lvlOverride>
   </w:num>
   <w:num w:numId="4" w16cid:durableId="1460538771">
-    <w:abstractNumId w:val="23"/>
+    <w:abstractNumId w:val="24"/>
     <w:lvlOverride w:ilvl="0">
       <w:lvl w:ilvl="0">
         <w:start w:val="4"/>
@@ -5093,7 +4918,7 @@
     </w:lvlOverride>
   </w:num>
   <w:num w:numId="5" w16cid:durableId="736516385">
-    <w:abstractNumId w:val="23"/>
+    <w:abstractNumId w:val="24"/>
     <w:lvlOverride w:ilvl="0">
       <w:lvl w:ilvl="0">
         <w:start w:val="5"/>
@@ -5108,19 +4933,19 @@
     </w:lvlOverride>
   </w:num>
   <w:num w:numId="6" w16cid:durableId="705495085">
-    <w:abstractNumId w:val="22"/>
+    <w:abstractNumId w:val="23"/>
   </w:num>
   <w:num w:numId="7" w16cid:durableId="1410036715">
     <w:abstractNumId w:val="10"/>
   </w:num>
   <w:num w:numId="8" w16cid:durableId="1997953648">
-    <w:abstractNumId w:val="15"/>
+    <w:abstractNumId w:val="16"/>
   </w:num>
   <w:num w:numId="9" w16cid:durableId="1117139839">
-    <w:abstractNumId w:val="17"/>
+    <w:abstractNumId w:val="18"/>
   </w:num>
   <w:num w:numId="10" w16cid:durableId="886794185">
-    <w:abstractNumId w:val="14"/>
+    <w:abstractNumId w:val="15"/>
   </w:num>
   <w:num w:numId="11" w16cid:durableId="1477918187">
     <w:abstractNumId w:val="8"/>
@@ -5156,7 +4981,7 @@
     </w:lvlOverride>
   </w:num>
   <w:num w:numId="14" w16cid:durableId="134763434">
-    <w:abstractNumId w:val="19"/>
+    <w:abstractNumId w:val="20"/>
   </w:num>
   <w:num w:numId="15" w16cid:durableId="857543823">
     <w:abstractNumId w:val="2"/>
@@ -5174,7 +4999,7 @@
     <w:abstractNumId w:val="0"/>
   </w:num>
   <w:num w:numId="20" w16cid:durableId="1363899549">
-    <w:abstractNumId w:val="13"/>
+    <w:abstractNumId w:val="14"/>
   </w:num>
   <w:num w:numId="21" w16cid:durableId="809327540">
     <w:abstractNumId w:val="3"/>
@@ -5183,25 +5008,28 @@
     <w:abstractNumId w:val="1"/>
   </w:num>
   <w:num w:numId="23" w16cid:durableId="1584026966">
-    <w:abstractNumId w:val="16"/>
+    <w:abstractNumId w:val="17"/>
   </w:num>
   <w:num w:numId="24" w16cid:durableId="1384251811">
     <w:abstractNumId w:val="7"/>
   </w:num>
   <w:num w:numId="25" w16cid:durableId="1293901828">
-    <w:abstractNumId w:val="21"/>
+    <w:abstractNumId w:val="22"/>
   </w:num>
   <w:num w:numId="26" w16cid:durableId="317269519">
-    <w:abstractNumId w:val="18"/>
+    <w:abstractNumId w:val="19"/>
   </w:num>
   <w:num w:numId="27" w16cid:durableId="477573739">
-    <w:abstractNumId w:val="12"/>
+    <w:abstractNumId w:val="13"/>
   </w:num>
   <w:num w:numId="28" w16cid:durableId="2039819548">
-    <w:abstractNumId w:val="20"/>
+    <w:abstractNumId w:val="21"/>
   </w:num>
   <w:num w:numId="29" w16cid:durableId="384335641">
     <w:abstractNumId w:val="11"/>
+  </w:num>
+  <w:num w:numId="30" w16cid:durableId="99498325">
+    <w:abstractNumId w:val="12"/>
   </w:num>
 </w:numbering>
 </file>

</xml_diff>